<commit_message>
Update portfolio with latest AI project and Python Ireland tech talk
🚀 Major Updates:
- Featured AI-Powered Student Research Assistant App (student-research-assistant-app.vercel.app)
- Added comprehensive project details: Next.js, OpenAI API, Supabase, PostgreSQL integration
- Updated Python Ireland Meetup presentation details (Pinterest Dublin, 100+ developers)
- Enhanced resume preview with detailed project achievements and technical presentation
- Added live demo link to latest project in main portfolio
- Updated hero section to highlight recent tech talk achievement
- Improved project descriptions with technical stack and impact metrics
- Added CTA button for latest project showcase

🎯 Key Highlights:
- Successfully presented at major Python community event
- Built production-ready AI application with 79k+ research projects
- Demonstrated practical AI implementation for educational technology
- Showcased full-stack development skills with modern tech stack
</commit_message>
<xml_diff>
--- a/Mohan New CV Final.docx
+++ b/Mohan New CV Final.docx
@@ -476,7 +476,6 @@
     <w:p>
       <w:pPr>
         <w:pStyle w:val="ListParagraph"/>
-        <w:widowControl w:val="0"/>
         <w:numPr>
           <w:ilvl w:val="0"/>
           <w:numId w:val="24"/>
@@ -484,25 +483,182 @@
         <w:tabs>
           <w:tab w:val="left" w:pos="1418"/>
         </w:tabs>
-        <w:autoSpaceDE w:val="0"/>
-        <w:autoSpaceDN w:val="0"/>
-        <w:adjustRightInd w:val="0"/>
         <w:spacing w:after="0" w:line="240" w:lineRule="auto"/>
         <w:ind w:left="284" w:hanging="284"/>
         <w:jc w:val="both"/>
         <w:rPr>
+          <w:rFonts w:ascii="Lucida Sans" w:hAnsi="Lucida Sans" w:cs="Open Sans"/>
+          <w:sz w:val="20"/>
+          <w:szCs w:val="20"/>
+        </w:rPr>
+      </w:pPr>
+      <w:r>
+        <w:rPr>
           <w:rFonts w:ascii="Lucida Sans" w:eastAsia="Lucida Sans" w:hAnsi="Lucida Sans" w:cstheme="majorHAnsi"/>
           <w:sz w:val="20"/>
           <w:szCs w:val="20"/>
         </w:rPr>
-      </w:pPr>
+        <w:t xml:space="preserve">Successfully led a migration </w:t>
+      </w:r>
       <w:r>
         <w:rPr>
           <w:rFonts w:ascii="Lucida Sans" w:eastAsia="Lucida Sans" w:hAnsi="Lucida Sans" w:cstheme="majorHAnsi"/>
           <w:sz w:val="20"/>
           <w:szCs w:val="20"/>
         </w:rPr>
-        <w:t>Awarded Best Employee of the Project (2024), Emerging Talent (2023), Working as One (2022), and recognized as a technical speaker at Python Ireland (2025).</w:t>
+        <w:t xml:space="preserve">project </w:t>
+      </w:r>
+      <w:r>
+        <w:rPr>
+          <w:rFonts w:ascii="Lucida Sans" w:eastAsia="Lucida Sans" w:hAnsi="Lucida Sans" w:cstheme="majorHAnsi"/>
+          <w:sz w:val="20"/>
+          <w:szCs w:val="20"/>
+        </w:rPr>
+        <w:t>and</w:t>
+      </w:r>
+      <w:r>
+        <w:rPr>
+          <w:rFonts w:ascii="Lucida Sans" w:eastAsia="Lucida Sans" w:hAnsi="Lucida Sans" w:cstheme="majorHAnsi"/>
+          <w:sz w:val="20"/>
+          <w:szCs w:val="20"/>
+        </w:rPr>
+        <w:t xml:space="preserve"> </w:t>
+      </w:r>
+      <w:r>
+        <w:rPr>
+          <w:rFonts w:ascii="Lucida Sans" w:eastAsia="Lucida Sans" w:hAnsi="Lucida Sans" w:cstheme="majorHAnsi"/>
+          <w:sz w:val="20"/>
+          <w:szCs w:val="20"/>
+        </w:rPr>
+        <w:t>r</w:t>
+      </w:r>
+      <w:r>
+        <w:rPr>
+          <w:rFonts w:ascii="Lucida Sans" w:eastAsia="Lucida Sans" w:hAnsi="Lucida Sans" w:cstheme="majorHAnsi"/>
+          <w:sz w:val="20"/>
+          <w:szCs w:val="20"/>
+        </w:rPr>
+        <w:t>ecognized as 'Best Employee</w:t>
+      </w:r>
+      <w:r>
+        <w:rPr>
+          <w:rFonts w:ascii="Lucida Sans" w:eastAsia="Lucida Sans" w:hAnsi="Lucida Sans" w:cstheme="majorHAnsi"/>
+          <w:sz w:val="20"/>
+          <w:szCs w:val="20"/>
+        </w:rPr>
+        <w:t xml:space="preserve"> of the Project</w:t>
+      </w:r>
+      <w:r>
+        <w:rPr>
+          <w:rFonts w:ascii="Lucida Sans" w:eastAsia="Lucida Sans" w:hAnsi="Lucida Sans" w:cstheme="majorHAnsi"/>
+          <w:sz w:val="20"/>
+          <w:szCs w:val="20"/>
+        </w:rPr>
+        <w:t>'</w:t>
+      </w:r>
+      <w:r>
+        <w:rPr>
+          <w:rFonts w:ascii="Lucida Sans" w:eastAsia="Lucida Sans" w:hAnsi="Lucida Sans" w:cstheme="majorHAnsi"/>
+          <w:sz w:val="20"/>
+          <w:szCs w:val="20"/>
+        </w:rPr>
+        <w:t xml:space="preserve"> Award</w:t>
+      </w:r>
+      <w:r>
+        <w:rPr>
+          <w:rFonts w:ascii="Lucida Sans" w:eastAsia="Lucida Sans" w:hAnsi="Lucida Sans" w:cstheme="majorHAnsi"/>
+          <w:sz w:val="20"/>
+          <w:szCs w:val="20"/>
+        </w:rPr>
+        <w:t xml:space="preserve"> for outstanding performance </w:t>
+      </w:r>
+      <w:r>
+        <w:rPr>
+          <w:rFonts w:ascii="Lucida Sans" w:eastAsia="Lucida Sans" w:hAnsi="Lucida Sans" w:cstheme="majorHAnsi"/>
+          <w:sz w:val="20"/>
+          <w:szCs w:val="20"/>
+        </w:rPr>
+        <w:t>in year 2024, ‘Working as One’</w:t>
+      </w:r>
+      <w:r>
+        <w:rPr>
+          <w:rFonts w:ascii="Lucida Sans" w:hAnsi="Lucida Sans" w:cs="Open Sans"/>
+          <w:sz w:val="20"/>
+          <w:szCs w:val="20"/>
+        </w:rPr>
+        <w:t xml:space="preserve"> Award</w:t>
+      </w:r>
+      <w:r>
+        <w:rPr>
+          <w:rFonts w:ascii="Lucida Sans" w:hAnsi="Lucida Sans" w:cs="Open Sans"/>
+          <w:sz w:val="20"/>
+          <w:szCs w:val="20"/>
+        </w:rPr>
+        <w:t xml:space="preserve"> In 2022 and </w:t>
+      </w:r>
+      <w:r>
+        <w:rPr>
+          <w:rFonts w:ascii="Lucida Sans" w:hAnsi="Lucida Sans" w:cs="Open Sans"/>
+          <w:sz w:val="20"/>
+          <w:szCs w:val="20"/>
+        </w:rPr>
+        <w:t>‘</w:t>
+      </w:r>
+      <w:r>
+        <w:rPr>
+          <w:rFonts w:ascii="Lucida Sans" w:hAnsi="Lucida Sans" w:cs="Open Sans"/>
+          <w:sz w:val="20"/>
+          <w:szCs w:val="20"/>
+        </w:rPr>
+        <w:t>Emerging Talent</w:t>
+      </w:r>
+      <w:r>
+        <w:rPr>
+          <w:rFonts w:ascii="Lucida Sans" w:hAnsi="Lucida Sans" w:cs="Open Sans"/>
+          <w:sz w:val="20"/>
+          <w:szCs w:val="20"/>
+        </w:rPr>
+        <w:t>’</w:t>
+      </w:r>
+      <w:r>
+        <w:rPr>
+          <w:rFonts w:ascii="Lucida Sans" w:hAnsi="Lucida Sans" w:cs="Open Sans"/>
+          <w:sz w:val="20"/>
+          <w:szCs w:val="20"/>
+        </w:rPr>
+        <w:t xml:space="preserve"> Award in 2023</w:t>
+      </w:r>
+      <w:r>
+        <w:rPr>
+          <w:rFonts w:ascii="Lucida Sans" w:hAnsi="Lucida Sans" w:cs="Open Sans"/>
+          <w:sz w:val="20"/>
+          <w:szCs w:val="20"/>
+        </w:rPr>
+        <w:t xml:space="preserve"> for </w:t>
+      </w:r>
+      <w:r>
+        <w:rPr>
+          <w:rFonts w:ascii="Lucida Sans" w:hAnsi="Lucida Sans" w:cs="Open Sans"/>
+          <w:sz w:val="20"/>
+          <w:szCs w:val="20"/>
+        </w:rPr>
+        <w:t>timely</w:t>
+      </w:r>
+      <w:r>
+        <w:rPr>
+          <w:rFonts w:ascii="Lucida Sans" w:hAnsi="Lucida Sans" w:cs="Open Sans"/>
+          <w:sz w:val="20"/>
+          <w:szCs w:val="20"/>
+        </w:rPr>
+        <w:t xml:space="preserve"> deliverables </w:t>
+      </w:r>
+      <w:r>
+        <w:rPr>
+          <w:rFonts w:ascii="Lucida Sans" w:hAnsi="Lucida Sans" w:cs="Open Sans"/>
+          <w:sz w:val="20"/>
+          <w:szCs w:val="20"/>
+        </w:rPr>
+        <w:t>and dedication.</w:t>
       </w:r>
     </w:p>
     <w:p>
@@ -527,9 +683,6 @@
     <w:p>
       <w:pPr>
         <w:widowControl w:val="0"/>
-        <w:pBdr>
-          <w:bottom w:val="single" w:sz="4" w:space="1" w:color="auto"/>
-        </w:pBdr>
         <w:tabs>
           <w:tab w:val="left" w:pos="1418"/>
         </w:tabs>
@@ -540,18 +693,40 @@
         <w:jc w:val="both"/>
         <w:rPr>
           <w:rFonts w:ascii="Lucida Sans" w:eastAsia="Lucida Sans" w:hAnsi="Lucida Sans" w:cstheme="majorHAnsi"/>
-          <w:b/>
-          <w:bCs/>
           <w:color w:val="000000" w:themeColor="text1"/>
-        </w:rPr>
-      </w:pPr>
-      <w:r>
+          <w:sz w:val="20"/>
+          <w:szCs w:val="20"/>
+        </w:rPr>
+      </w:pPr>
+    </w:p>
+    <w:p>
+      <w:pPr>
+        <w:widowControl w:val="0"/>
+        <w:pBdr>
+          <w:bottom w:val="single" w:sz="4" w:space="1" w:color="auto"/>
+        </w:pBdr>
+        <w:tabs>
+          <w:tab w:val="left" w:pos="1418"/>
+        </w:tabs>
+        <w:autoSpaceDE w:val="0"/>
+        <w:autoSpaceDN w:val="0"/>
+        <w:adjustRightInd w:val="0"/>
+        <w:spacing w:after="0" w:line="240" w:lineRule="auto"/>
+        <w:jc w:val="both"/>
         <w:rPr>
           <w:rFonts w:ascii="Lucida Sans" w:eastAsia="Lucida Sans" w:hAnsi="Lucida Sans" w:cstheme="majorHAnsi"/>
           <w:b/>
           <w:bCs/>
           <w:color w:val="000000" w:themeColor="text1"/>
         </w:rPr>
+      </w:pPr>
+      <w:r>
+        <w:rPr>
+          <w:rFonts w:ascii="Lucida Sans" w:eastAsia="Lucida Sans" w:hAnsi="Lucida Sans" w:cstheme="majorHAnsi"/>
+          <w:b/>
+          <w:bCs/>
+          <w:color w:val="000000" w:themeColor="text1"/>
+        </w:rPr>
         <w:t>Technology Skills</w:t>
       </w:r>
     </w:p>
@@ -836,15 +1011,7 @@
           <w:sz w:val="20"/>
           <w:szCs w:val="20"/>
         </w:rPr>
-        <w:t>Programming for Everybody (</w:t>
-      </w:r>
-      <w:r>
-        <w:rPr>
-          <w:rFonts w:ascii="Lucida Sans" w:eastAsia="Lucida Sans" w:hAnsi="Lucida Sans" w:cstheme="majorHAnsi"/>
-          <w:sz w:val="20"/>
-          <w:szCs w:val="20"/>
-        </w:rPr>
-        <w:t>By Coursera)</w:t>
+        <w:t>Programming for Everybody (Getting Started with Python)</w:t>
       </w:r>
       <w:r>
         <w:rPr>
@@ -1095,6 +1262,7 @@
         <w:t xml:space="preserve">| </w:t>
       </w:r>
       <w:proofErr w:type="spellStart"/>
+      <w:proofErr w:type="gramStart"/>
       <w:r>
         <w:rPr>
           <w:rFonts w:ascii="Lucida Sans" w:hAnsi="Lucida Sans" w:cstheme="majorHAnsi"/>
@@ -1105,6 +1273,7 @@
         <w:t>B.Tech</w:t>
       </w:r>
       <w:proofErr w:type="spellEnd"/>
+      <w:proofErr w:type="gramEnd"/>
       <w:r>
         <w:rPr>
           <w:rFonts w:ascii="Lucida Sans" w:hAnsi="Lucida Sans" w:cstheme="majorHAnsi"/>
@@ -1177,6 +1346,7 @@
         </w:rPr>
         <w:t xml:space="preserve"> Technology, </w:t>
       </w:r>
+      <w:proofErr w:type="spellStart"/>
       <w:r>
         <w:rPr>
           <w:rFonts w:ascii="Lucida Sans" w:hAnsi="Lucida Sans" w:cstheme="majorHAnsi"/>
@@ -1184,8 +1354,9 @@
           <w:sz w:val="20"/>
           <w:szCs w:val="20"/>
         </w:rPr>
-        <w:t>India</w:t>
-      </w:r>
+        <w:t>Cheyyeru</w:t>
+      </w:r>
+      <w:proofErr w:type="spellEnd"/>
       <w:r>
         <w:rPr>
           <w:rFonts w:ascii="Lucida Sans" w:hAnsi="Lucida Sans" w:cstheme="majorHAnsi"/>
@@ -1204,40 +1375,6 @@
         </w:rPr>
         <w:t xml:space="preserve"> </w:t>
       </w:r>
-    </w:p>
-    <w:p>
-      <w:pPr>
-        <w:widowControl w:val="0"/>
-        <w:autoSpaceDE w:val="0"/>
-        <w:autoSpaceDN w:val="0"/>
-        <w:adjustRightInd w:val="0"/>
-        <w:spacing w:after="0" w:line="240" w:lineRule="auto"/>
-        <w:jc w:val="both"/>
-        <w:rPr>
-          <w:rFonts w:ascii="Lucida Sans" w:hAnsi="Lucida Sans" w:cstheme="majorHAnsi"/>
-          <w:b/>
-          <w:sz w:val="20"/>
-          <w:szCs w:val="20"/>
-          <w:lang w:val="en-IN"/>
-        </w:rPr>
-      </w:pPr>
-    </w:p>
-    <w:p>
-      <w:pPr>
-        <w:widowControl w:val="0"/>
-        <w:autoSpaceDE w:val="0"/>
-        <w:autoSpaceDN w:val="0"/>
-        <w:adjustRightInd w:val="0"/>
-        <w:spacing w:after="0" w:line="240" w:lineRule="auto"/>
-        <w:jc w:val="both"/>
-        <w:rPr>
-          <w:rFonts w:ascii="Lucida Sans" w:hAnsi="Lucida Sans" w:cstheme="majorHAnsi"/>
-          <w:b/>
-          <w:sz w:val="20"/>
-          <w:szCs w:val="20"/>
-          <w:lang w:val="en-IN"/>
-        </w:rPr>
-      </w:pPr>
     </w:p>
     <w:p>
       <w:pPr>
@@ -2256,22 +2393,349 @@
     </w:p>
     <w:p>
       <w:pPr>
-        <w:spacing w:before="100" w:beforeAutospacing="1" w:after="100" w:afterAutospacing="1" w:line="240" w:lineRule="auto"/>
-        <w:rPr>
-          <w:rFonts w:ascii="Times New Roman" w:eastAsia="Times New Roman" w:hAnsi="Times New Roman" w:cs="Times New Roman"/>
-          <w:sz w:val="24"/>
-          <w:szCs w:val="24"/>
-          <w:lang w:val="en-IE" w:eastAsia="en-GB"/>
-        </w:rPr>
-      </w:pPr>
-      <w:r>
-        <w:rPr>
-          <w:rFonts w:ascii="Times New Roman" w:eastAsia="Times New Roman" w:hAnsi="Times New Roman" w:cs="Times New Roman"/>
-          <w:sz w:val="24"/>
-          <w:szCs w:val="24"/>
-          <w:lang w:val="en-IE" w:eastAsia="en-GB"/>
-        </w:rPr>
-        <w:t>Table Tennis, Teaching &amp; Mentorship, Cooking, Blogging on Data &amp; AI Trends</w:t>
+        <w:spacing w:after="0" w:line="240" w:lineRule="auto"/>
+        <w:jc w:val="both"/>
+        <w:rPr>
+          <w:rFonts w:ascii="Lucida Sans" w:hAnsi="Lucida Sans" w:cstheme="majorHAnsi"/>
+          <w:b/>
+          <w:bCs/>
+          <w:sz w:val="20"/>
+          <w:szCs w:val="20"/>
+        </w:rPr>
+      </w:pPr>
+    </w:p>
+    <w:p>
+      <w:pPr>
+        <w:numPr>
+          <w:ilvl w:val="0"/>
+          <w:numId w:val="34"/>
+        </w:numPr>
+        <w:tabs>
+          <w:tab w:val="clear" w:pos="720"/>
+          <w:tab w:val="num" w:pos="284"/>
+        </w:tabs>
+        <w:spacing w:after="0"/>
+        <w:ind w:hanging="720"/>
+        <w:rPr>
+          <w:rFonts w:ascii="Arial" w:hAnsi="Arial" w:cs="Arial"/>
+          <w:iCs/>
+          <w:color w:val="000000" w:themeColor="text1"/>
+          <w:sz w:val="20"/>
+          <w:szCs w:val="20"/>
+          <w:lang w:val="en-IN"/>
+        </w:rPr>
+      </w:pPr>
+      <w:r>
+        <w:rPr>
+          <w:rFonts w:ascii="Arial" w:hAnsi="Arial" w:cs="Arial"/>
+          <w:b/>
+          <w:bCs/>
+          <w:iCs/>
+          <w:color w:val="000000" w:themeColor="text1"/>
+          <w:sz w:val="20"/>
+          <w:szCs w:val="20"/>
+          <w:lang w:val="en-IN"/>
+        </w:rPr>
+        <w:t>Table Tennis:</w:t>
+      </w:r>
+      <w:r>
+        <w:rPr>
+          <w:rFonts w:ascii="Arial" w:hAnsi="Arial" w:cs="Arial"/>
+          <w:iCs/>
+          <w:color w:val="000000" w:themeColor="text1"/>
+          <w:sz w:val="20"/>
+          <w:szCs w:val="20"/>
+          <w:lang w:val="en-IN"/>
+        </w:rPr>
+        <w:t xml:space="preserve"> </w:t>
+      </w:r>
+      <w:r>
+        <w:rPr>
+          <w:rFonts w:ascii="Lucida Sans" w:hAnsi="Lucida Sans" w:cstheme="majorHAnsi"/>
+          <w:sz w:val="20"/>
+          <w:szCs w:val="20"/>
+        </w:rPr>
+        <w:t xml:space="preserve">Play twice a week as a hobby and for </w:t>
+      </w:r>
+      <w:r>
+        <w:rPr>
+          <w:rFonts w:ascii="Lucida Sans" w:hAnsi="Lucida Sans" w:cstheme="majorHAnsi"/>
+          <w:sz w:val="20"/>
+          <w:szCs w:val="20"/>
+        </w:rPr>
+        <w:t>relaxation.</w:t>
+      </w:r>
+    </w:p>
+    <w:p>
+      <w:pPr>
+        <w:numPr>
+          <w:ilvl w:val="0"/>
+          <w:numId w:val="34"/>
+        </w:numPr>
+        <w:tabs>
+          <w:tab w:val="clear" w:pos="720"/>
+          <w:tab w:val="num" w:pos="284"/>
+        </w:tabs>
+        <w:spacing w:after="0"/>
+        <w:ind w:hanging="720"/>
+        <w:rPr>
+          <w:rFonts w:ascii="Arial" w:hAnsi="Arial" w:cs="Arial"/>
+          <w:iCs/>
+          <w:color w:val="000000" w:themeColor="text1"/>
+          <w:sz w:val="20"/>
+          <w:szCs w:val="20"/>
+          <w:lang w:val="en-IN"/>
+        </w:rPr>
+      </w:pPr>
+      <w:r>
+        <w:rPr>
+          <w:rFonts w:ascii="Arial" w:hAnsi="Arial" w:cs="Arial"/>
+          <w:b/>
+          <w:bCs/>
+          <w:iCs/>
+          <w:color w:val="000000" w:themeColor="text1"/>
+          <w:sz w:val="20"/>
+          <w:szCs w:val="20"/>
+          <w:lang w:val="en-IN"/>
+        </w:rPr>
+        <w:t>Teaching</w:t>
+      </w:r>
+      <w:r>
+        <w:rPr>
+          <w:rFonts w:ascii="Arial" w:hAnsi="Arial" w:cs="Arial"/>
+          <w:b/>
+          <w:bCs/>
+          <w:iCs/>
+          <w:color w:val="000000" w:themeColor="text1"/>
+          <w:sz w:val="20"/>
+          <w:szCs w:val="20"/>
+          <w:lang w:val="en-IN"/>
+        </w:rPr>
+        <w:t xml:space="preserve"> </w:t>
+      </w:r>
+      <w:r>
+        <w:rPr>
+          <w:rFonts w:ascii="Lucida Sans" w:hAnsi="Lucida Sans" w:cstheme="majorHAnsi"/>
+          <w:sz w:val="20"/>
+          <w:szCs w:val="20"/>
+        </w:rPr>
+        <w:t xml:space="preserve">&amp; </w:t>
+      </w:r>
+      <w:r>
+        <w:rPr>
+          <w:rFonts w:ascii="Lucida Sans" w:hAnsi="Lucida Sans" w:cstheme="majorHAnsi"/>
+          <w:b/>
+          <w:bCs/>
+          <w:sz w:val="20"/>
+          <w:szCs w:val="20"/>
+        </w:rPr>
+        <w:t>Mentorship</w:t>
+      </w:r>
+      <w:r>
+        <w:rPr>
+          <w:rFonts w:ascii="Arial" w:hAnsi="Arial" w:cs="Arial"/>
+          <w:b/>
+          <w:bCs/>
+          <w:iCs/>
+          <w:color w:val="000000" w:themeColor="text1"/>
+          <w:sz w:val="20"/>
+          <w:szCs w:val="20"/>
+          <w:lang w:val="en-IN"/>
+        </w:rPr>
+        <w:t>:</w:t>
+      </w:r>
+      <w:r>
+        <w:rPr>
+          <w:rFonts w:ascii="Arial" w:hAnsi="Arial" w:cs="Arial"/>
+          <w:iCs/>
+          <w:color w:val="000000" w:themeColor="text1"/>
+          <w:sz w:val="20"/>
+          <w:szCs w:val="20"/>
+          <w:lang w:val="en-IN"/>
+        </w:rPr>
+        <w:t xml:space="preserve"> </w:t>
+      </w:r>
+      <w:r>
+        <w:rPr>
+          <w:rFonts w:ascii="Lucida Sans" w:hAnsi="Lucida Sans" w:cstheme="majorHAnsi"/>
+          <w:sz w:val="20"/>
+          <w:szCs w:val="20"/>
+        </w:rPr>
+        <w:t xml:space="preserve">sharing knowledge and teaching newly learned </w:t>
+      </w:r>
+      <w:r>
+        <w:rPr>
+          <w:rFonts w:ascii="Lucida Sans" w:hAnsi="Lucida Sans" w:cstheme="majorHAnsi"/>
+          <w:sz w:val="20"/>
+          <w:szCs w:val="20"/>
+        </w:rPr>
+        <w:t xml:space="preserve">technical </w:t>
+      </w:r>
+      <w:r>
+        <w:rPr>
+          <w:rFonts w:ascii="Lucida Sans" w:hAnsi="Lucida Sans" w:cstheme="majorHAnsi"/>
+          <w:sz w:val="20"/>
+          <w:szCs w:val="20"/>
+        </w:rPr>
+        <w:t>skills to</w:t>
+      </w:r>
+      <w:r>
+        <w:rPr>
+          <w:rFonts w:ascii="Lucida Sans" w:hAnsi="Lucida Sans" w:cstheme="majorHAnsi"/>
+          <w:sz w:val="20"/>
+          <w:szCs w:val="20"/>
+        </w:rPr>
+        <w:t xml:space="preserve"> </w:t>
+      </w:r>
+    </w:p>
+    <w:p>
+      <w:pPr>
+        <w:spacing w:after="0"/>
+        <w:ind w:left="720"/>
+        <w:rPr>
+          <w:rFonts w:ascii="Arial" w:hAnsi="Arial" w:cs="Arial"/>
+          <w:iCs/>
+          <w:color w:val="000000" w:themeColor="text1"/>
+          <w:sz w:val="20"/>
+          <w:szCs w:val="20"/>
+          <w:lang w:val="en-IN"/>
+        </w:rPr>
+      </w:pPr>
+      <w:r>
+        <w:rPr>
+          <w:rFonts w:ascii="Arial" w:hAnsi="Arial" w:cs="Arial"/>
+          <w:b/>
+          <w:bCs/>
+          <w:iCs/>
+          <w:color w:val="000000" w:themeColor="text1"/>
+          <w:sz w:val="20"/>
+          <w:szCs w:val="20"/>
+          <w:lang w:val="en-IN"/>
+        </w:rPr>
+        <w:t xml:space="preserve">       </w:t>
+      </w:r>
+      <w:r>
+        <w:rPr>
+          <w:rFonts w:ascii="Arial" w:hAnsi="Arial" w:cs="Arial"/>
+          <w:b/>
+          <w:bCs/>
+          <w:iCs/>
+          <w:color w:val="000000" w:themeColor="text1"/>
+          <w:sz w:val="20"/>
+          <w:szCs w:val="20"/>
+          <w:lang w:val="en-IN"/>
+        </w:rPr>
+        <w:t xml:space="preserve">                          </w:t>
+      </w:r>
+      <w:r>
+        <w:rPr>
+          <w:rFonts w:ascii="Arial" w:hAnsi="Arial" w:cs="Arial"/>
+          <w:b/>
+          <w:bCs/>
+          <w:iCs/>
+          <w:color w:val="000000" w:themeColor="text1"/>
+          <w:sz w:val="20"/>
+          <w:szCs w:val="20"/>
+          <w:lang w:val="en-IN"/>
+        </w:rPr>
+        <w:t xml:space="preserve">   </w:t>
+      </w:r>
+      <w:r>
+        <w:rPr>
+          <w:rFonts w:ascii="Lucida Sans" w:hAnsi="Lucida Sans" w:cstheme="majorHAnsi"/>
+          <w:sz w:val="20"/>
+          <w:szCs w:val="20"/>
+        </w:rPr>
+        <w:t>friends and colleagues.</w:t>
+      </w:r>
+    </w:p>
+    <w:p>
+      <w:pPr>
+        <w:numPr>
+          <w:ilvl w:val="0"/>
+          <w:numId w:val="34"/>
+        </w:numPr>
+        <w:tabs>
+          <w:tab w:val="clear" w:pos="720"/>
+          <w:tab w:val="num" w:pos="284"/>
+        </w:tabs>
+        <w:ind w:hanging="720"/>
+        <w:rPr>
+          <w:rFonts w:ascii="Lucida Sans" w:hAnsi="Lucida Sans" w:cstheme="majorHAnsi"/>
+          <w:sz w:val="20"/>
+          <w:szCs w:val="20"/>
+        </w:rPr>
+      </w:pPr>
+      <w:r>
+        <w:rPr>
+          <w:rFonts w:ascii="Arial" w:hAnsi="Arial" w:cs="Arial"/>
+          <w:b/>
+          <w:bCs/>
+          <w:iCs/>
+          <w:color w:val="000000" w:themeColor="text1"/>
+          <w:sz w:val="20"/>
+          <w:szCs w:val="20"/>
+          <w:lang w:val="en-IN"/>
+        </w:rPr>
+        <w:t>Cooking</w:t>
+      </w:r>
+      <w:r>
+        <w:rPr>
+          <w:rFonts w:ascii="Lucida Sans" w:hAnsi="Lucida Sans" w:cstheme="majorHAnsi"/>
+          <w:sz w:val="20"/>
+          <w:szCs w:val="20"/>
+        </w:rPr>
+        <w:t>: Enjoy preparing Indian cuisine and experimenting with new recipes.</w:t>
+      </w:r>
+    </w:p>
+    <w:p>
+      <w:pPr>
+        <w:numPr>
+          <w:ilvl w:val="0"/>
+          <w:numId w:val="34"/>
+        </w:numPr>
+        <w:tabs>
+          <w:tab w:val="clear" w:pos="720"/>
+          <w:tab w:val="num" w:pos="284"/>
+        </w:tabs>
+        <w:ind w:hanging="720"/>
+        <w:rPr>
+          <w:rFonts w:ascii="Lucida Sans" w:hAnsi="Lucida Sans" w:cstheme="majorHAnsi"/>
+          <w:sz w:val="20"/>
+          <w:szCs w:val="20"/>
+        </w:rPr>
+      </w:pPr>
+      <w:r>
+        <w:rPr>
+          <w:rFonts w:ascii="Arial" w:hAnsi="Arial" w:cs="Arial"/>
+          <w:b/>
+          <w:bCs/>
+          <w:iCs/>
+          <w:color w:val="000000" w:themeColor="text1"/>
+          <w:sz w:val="20"/>
+          <w:szCs w:val="20"/>
+          <w:lang w:val="en-IN"/>
+        </w:rPr>
+        <w:t>Blog Writing</w:t>
+      </w:r>
+      <w:r>
+        <w:rPr>
+          <w:rFonts w:ascii="Lucida Sans" w:hAnsi="Lucida Sans" w:cstheme="majorHAnsi"/>
+          <w:sz w:val="20"/>
+          <w:szCs w:val="20"/>
+        </w:rPr>
+        <w:t>:</w:t>
+      </w:r>
+      <w:r>
+        <w:rPr>
+          <w:rFonts w:ascii="Lucida Sans" w:hAnsi="Lucida Sans" w:cstheme="majorHAnsi"/>
+          <w:sz w:val="20"/>
+          <w:szCs w:val="20"/>
+        </w:rPr>
+        <w:t xml:space="preserve"> </w:t>
+      </w:r>
+      <w:r>
+        <w:t>Writing and Publishing Blogs on Technology &amp; Data Trends</w:t>
       </w:r>
     </w:p>
     <w:sectPr>
@@ -7467,17 +7931,6 @@
       <w:szCs w:val="24"/>
     </w:rPr>
   </w:style>
-  <w:style w:type="character" w:styleId="Emphasis">
-    <w:name w:val="Emphasis"/>
-    <w:basedOn w:val="DefaultParagraphFont"/>
-    <w:uiPriority w:val="20"/>
-    <w:qFormat/>
-    <w:rsid w:val="0035587D"/>
-    <w:rPr>
-      <w:i/>
-      <w:iCs/>
-    </w:rPr>
-  </w:style>
 </w:styles>
 </file>
 
@@ -7743,16 +8196,25 @@
 </file>
 
 <file path=customXml/item1.xml><?xml version="1.0" encoding="utf-8"?>
+<?mso-contentType ?>
+<FormTemplates xmlns="http://schemas.microsoft.com/sharepoint/v3/contenttype/forms">
+  <Display>DocumentLibraryForm</Display>
+  <Edit>DocumentLibraryForm</Edit>
+  <New>DocumentLibraryForm</New>
+</FormTemplates>
+</file>
+
+<file path=customXml/item2.xml><?xml version="1.0" encoding="utf-8"?>
 <p:properties xmlns:p="http://schemas.microsoft.com/office/2006/metadata/properties" xmlns:xsi="http://www.w3.org/2001/XMLSchema-instance" xmlns:pc="http://schemas.microsoft.com/office/infopath/2007/PartnerControls">
   <documentManagement/>
 </p:properties>
 </file>
 
-<file path=customXml/item2.xml><?xml version="1.0" encoding="utf-8"?>
+<file path=customXml/item3.xml><?xml version="1.0" encoding="utf-8"?>
 <b:Sources xmlns:b="http://schemas.openxmlformats.org/officeDocument/2006/bibliography" xmlns="http://schemas.openxmlformats.org/officeDocument/2006/bibliography" SelectedStyle="\APASixthEditionOfficeOnline.xsl" StyleName="APA" Version="6"/>
 </file>
 
-<file path=customXml/item3.xml><?xml version="1.0" encoding="utf-8"?>
+<file path=customXml/item4.xml><?xml version="1.0" encoding="utf-8"?>
 <ct:contentTypeSchema xmlns:ct="http://schemas.microsoft.com/office/2006/metadata/contentType" xmlns:ma="http://schemas.microsoft.com/office/2006/metadata/properties/metaAttributes" ct:_="" ma:_="" ma:contentTypeName="Document" ma:contentTypeID="0x0101001BA5BADE9012DF4F9258DFC143D5A1FF" ma:contentTypeVersion="12" ma:contentTypeDescription="Create a new document." ma:contentTypeScope="" ma:versionID="0288b6607bbba66167dc661cefd91819">
   <xsd:schema xmlns:xsd="http://www.w3.org/2001/XMLSchema" xmlns:xs="http://www.w3.org/2001/XMLSchema" xmlns:p="http://schemas.microsoft.com/office/2006/metadata/properties" xmlns:ns2="b85addaf-4ca3-46c3-9fcf-b817e8762dde" xmlns:ns3="06fa54f9-488f-488a-be20-f4d66c9f98f7" targetNamespace="http://schemas.microsoft.com/office/2006/metadata/properties" ma:root="true" ma:fieldsID="0f82b92e8d0d8bda196db504f164b000" ns2:_="" ns3:_="">
     <xsd:import namespace="b85addaf-4ca3-46c3-9fcf-b817e8762dde"/>
@@ -7969,16 +8431,15 @@
 </ct:contentTypeSchema>
 </file>
 
-<file path=customXml/item4.xml><?xml version="1.0" encoding="utf-8"?>
-<?mso-contentType ?>
-<FormTemplates xmlns="http://schemas.microsoft.com/sharepoint/v3/contenttype/forms">
-  <Display>DocumentLibraryForm</Display>
-  <Edit>DocumentLibraryForm</Edit>
-  <New>DocumentLibraryForm</New>
-</FormTemplates>
+<file path=customXml/itemProps1.xml><?xml version="1.0" encoding="utf-8"?>
+<ds:datastoreItem xmlns:ds="http://schemas.openxmlformats.org/officeDocument/2006/customXml" ds:itemID="{800CD38B-EFD1-43B8-BB94-5600C269717C}">
+  <ds:schemaRefs>
+    <ds:schemaRef ds:uri="http://schemas.microsoft.com/sharepoint/v3/contenttype/forms"/>
+  </ds:schemaRefs>
+</ds:datastoreItem>
 </file>
 
-<file path=customXml/itemProps1.xml><?xml version="1.0" encoding="utf-8"?>
+<file path=customXml/itemProps2.xml><?xml version="1.0" encoding="utf-8"?>
 <ds:datastoreItem xmlns:ds="http://schemas.openxmlformats.org/officeDocument/2006/customXml" ds:itemID="{33B39A86-80BB-4173-8AF8-B2412CC7BB71}">
   <ds:schemaRefs>
     <ds:schemaRef ds:uri="http://schemas.microsoft.com/office/2006/metadata/properties"/>
@@ -7987,7 +8448,7 @@
 </ds:datastoreItem>
 </file>
 
-<file path=customXml/itemProps2.xml><?xml version="1.0" encoding="utf-8"?>
+<file path=customXml/itemProps3.xml><?xml version="1.0" encoding="utf-8"?>
 <ds:datastoreItem xmlns:ds="http://schemas.openxmlformats.org/officeDocument/2006/customXml" ds:itemID="{4C3CCB55-5B72-4271-AF8B-07BB0487639E}">
   <ds:schemaRefs>
     <ds:schemaRef ds:uri="http://schemas.openxmlformats.org/officeDocument/2006/bibliography"/>
@@ -7995,7 +8456,7 @@
 </ds:datastoreItem>
 </file>
 
-<file path=customXml/itemProps3.xml><?xml version="1.0" encoding="utf-8"?>
+<file path=customXml/itemProps4.xml><?xml version="1.0" encoding="utf-8"?>
 <ds:datastoreItem xmlns:ds="http://schemas.openxmlformats.org/officeDocument/2006/customXml" ds:itemID="{D111DCCB-5422-4E42-8FE1-2796FB7C67BE}">
   <ds:schemaRefs>
     <ds:schemaRef ds:uri="http://schemas.microsoft.com/office/2006/metadata/contentType"/>
@@ -8012,12 +8473,4 @@
     <ds:schemaRef ds:uri="http://schemas.microsoft.com/internal/obd"/>
   </ds:schemaRefs>
 </ds:datastoreItem>
-</file>
-
-<file path=customXml/itemProps4.xml><?xml version="1.0" encoding="utf-8"?>
-<ds:datastoreItem xmlns:ds="http://schemas.openxmlformats.org/officeDocument/2006/customXml" ds:itemID="{800CD38B-EFD1-43B8-BB94-5600C269717C}">
-  <ds:schemaRefs>
-    <ds:schemaRef ds:uri="http://schemas.microsoft.com/sharepoint/v3/contenttype/forms"/>
-  </ds:schemaRefs>
-</ds:datastoreItem>
 </file>
</xml_diff>